<commit_message>
audit: harden portfolio architecture and content reliability
</commit_message>
<xml_diff>
--- a/public/cv/Ahmed_Aziz_Mhiri_CV_ATS.docx
+++ b/public/cv/Ahmed_Aziz_Mhiri_CV_ATS.docx
@@ -4,697 +4,913 @@
   <w:body>
     <w:p>
       <w:pPr>
-        <w:spacing w:before="0" w:after="0" w:line="240" w:lineRule="auto"/>
+        <w:spacing w:after="20"/>
         <w:jc w:val="center"/>
       </w:pPr>
       <w:r>
         <w:rPr>
-          <w:rFonts w:ascii="Arial" w:hAnsi="Arial" w:eastAsia="Arial" w:cs="Arial"/>
+          <w:rFonts w:ascii="Arial" w:hAnsi="Arial"/>
           <w:b/>
-          <w:color w:val="1E1E1E"/>
-          <w:sz w:val="37"/>
+          <w:color w:val="111111"/>
+          <w:sz w:val="40"/>
         </w:rPr>
         <w:t>AHMED AZIZ MHIRI</w:t>
       </w:r>
     </w:p>
     <w:p>
       <w:pPr>
-        <w:spacing w:before="20" w:after="0" w:line="240" w:lineRule="auto"/>
+        <w:spacing w:after="20"/>
         <w:jc w:val="center"/>
       </w:pPr>
       <w:r>
         <w:rPr>
-          <w:rFonts w:ascii="Arial" w:hAnsi="Arial" w:eastAsia="Arial" w:cs="Arial"/>
+          <w:rFonts w:ascii="Arial" w:hAnsi="Arial"/>
           <w:b/>
-          <w:color w:val="1E1E1E"/>
-          <w:sz w:val="19"/>
+          <w:sz w:val="21"/>
         </w:rPr>
-        <w:t>Marketing Analytics | Commercial Analytics | Business Intelligence | Process Automation</w:t>
+        <w:t>DATA-DRIVEN MARKETING &amp; COMMERCIAL ANALYTICS</w:t>
       </w:r>
     </w:p>
     <w:p>
       <w:pPr>
-        <w:spacing w:before="20" w:after="0" w:line="240" w:lineRule="auto"/>
+        <w:spacing w:after="40"/>
         <w:jc w:val="center"/>
       </w:pPr>
       <w:r>
         <w:rPr>
-          <w:rFonts w:ascii="Arial" w:hAnsi="Arial" w:eastAsia="Arial" w:cs="Arial"/>
-          <w:color w:val="1E1E1E"/>
-          <w:sz w:val="17"/>
+          <w:rFonts w:ascii="Arial" w:hAnsi="Arial"/>
+          <w:sz w:val="19"/>
         </w:rPr>
-        <w:t>Sousse, Tunisia  |  mhiriaziz13@gmail.com  |  linkedin.com/in/ahmed-aziz-mhiri  |  Available from Summer 2027</w:t>
+        <w:t>Business Intelligence | CRM &amp; Marketing Automation | Process Automation</w:t>
       </w:r>
     </w:p>
     <w:p>
       <w:pPr>
-        <w:keepNext/>
-        <w:spacing w:before="100" w:after="20" w:line="240" w:lineRule="auto"/>
+        <w:spacing w:after="0"/>
+        <w:jc w:val="center"/>
       </w:pPr>
       <w:r>
         <w:rPr>
-          <w:rFonts w:ascii="Arial" w:hAnsi="Arial" w:eastAsia="Arial" w:cs="Arial"/>
-          <w:b/>
-          <w:caps/>
-          <w:color w:val="1E1E1E"/>
-          <w:sz w:val="21"/>
+          <w:rFonts w:ascii="Arial" w:hAnsi="Arial"/>
+          <w:sz w:val="17"/>
         </w:rPr>
+        <w:t>Sousse, Tunisia</w:t>
+      </w:r>
+      <w:r>
+        <w:rPr>
+          <w:rFonts w:ascii="Arial" w:hAnsi="Arial"/>
+          <w:sz w:val="17"/>
+        </w:rPr>
+        <w:t xml:space="preserve"> | </w:t>
+      </w:r>
+      <w:hyperlink r:id="rId9">
+        <w:r>
+          <w:rPr>
+            <w:color w:val="000000"/>
+            <w:u w:val="none"/>
+            <w:sz w:val="17"/>
+            <w:szCs w:val="17"/>
+          </w:rPr>
+          <w:t>mhiriaziz13@gmail.com</w:t>
+        </w:r>
+      </w:hyperlink>
+      <w:r>
+        <w:rPr>
+          <w:rFonts w:ascii="Arial" w:hAnsi="Arial"/>
+          <w:sz w:val="17"/>
+        </w:rPr>
+        <w:t xml:space="preserve"> | </w:t>
+      </w:r>
+      <w:hyperlink r:id="rId10">
+        <w:r>
+          <w:rPr>
+            <w:color w:val="000000"/>
+            <w:u w:val="none"/>
+            <w:sz w:val="17"/>
+            <w:szCs w:val="17"/>
+          </w:rPr>
+          <w:t>linkedin.com/in/ahmed-aziz-mhiri</w:t>
+        </w:r>
+      </w:hyperlink>
+    </w:p>
+    <w:p>
+      <w:pPr>
+        <w:spacing w:after="100"/>
+        <w:jc w:val="center"/>
+      </w:pPr>
+      <w:r>
+        <w:rPr>
+          <w:rFonts w:ascii="Arial" w:hAnsi="Arial"/>
+          <w:sz w:val="17"/>
+        </w:rPr>
+        <w:t>International full-time opportunities from October 2027</w:t>
+      </w:r>
+    </w:p>
+    <w:p>
+      <w:pPr>
+        <w:pStyle w:val="Heading1"/>
+        <w:keepNext/>
+        <w:spacing w:before="120" w:after="60"/>
+      </w:pPr>
+      <w:r>
         <w:t>PROFESSIONAL SUMMARY</w:t>
       </w:r>
     </w:p>
     <w:p>
       <w:pPr>
-        <w:spacing w:before="0" w:after="0" w:line="240" w:lineRule="auto"/>
+        <w:spacing w:after="40" w:line="245" w:lineRule="auto"/>
       </w:pPr>
       <w:r>
         <w:rPr>
-          <w:rFonts w:ascii="Arial" w:hAnsi="Arial" w:eastAsia="Arial" w:cs="Arial"/>
-          <w:color w:val="1E1E1E"/>
-          <w:sz w:val="17"/>
+          <w:rFonts w:ascii="Arial" w:hAnsi="Arial"/>
+          <w:b w:val="0"/>
+          <w:i w:val="0"/>
+          <w:sz w:val="18"/>
         </w:rPr>
-        <w:t>Master's student in Big Data Analytics &amp; E-Commerce with Business Intelligence, marketing analytics, commercial analysis, digital marketing, process automation and full-stack project experience. Skilled in analysing business and customer data, supporting KPI reporting, improving customer journeys, automating workflows and translating operational requirements into structured solutions. Target roles include Marketing Analyst, Commercial Analyst, Business Intelligence Analyst, Digital Marketing Analyst, Revenue Operations Analyst, Process Automation Analyst and Junior Business Analyst.</w:t>
+        <w:t>Master's student in Big Data Analytics &amp; E-Commerce with a Bachelor's in Business Intelligence and experience in marketing analytics, commercial analytics, KPI reporting, customer journeys, business intelligence and process automation. Designed measurable digital and operational solutions across tourism, hospitality and service businesses. Target roles: Marketing Analyst, Commercial Analyst, Business Intelligence Analyst and Marketing Automation Analyst.</w:t>
       </w:r>
     </w:p>
     <w:p>
       <w:pPr>
+        <w:pStyle w:val="Heading1"/>
         <w:keepNext/>
-        <w:spacing w:before="100" w:after="20" w:line="240" w:lineRule="auto"/>
+        <w:spacing w:before="120" w:after="60"/>
       </w:pPr>
       <w:r>
-        <w:rPr>
-          <w:rFonts w:ascii="Arial" w:hAnsi="Arial" w:eastAsia="Arial" w:cs="Arial"/>
-          <w:b/>
-          <w:caps/>
-          <w:color w:val="1E1E1E"/>
-          <w:sz w:val="21"/>
-        </w:rPr>
-        <w:t>KEY SKILLS</w:t>
+        <w:t>CORE SKILLS</w:t>
       </w:r>
     </w:p>
     <w:p>
       <w:pPr>
-        <w:spacing w:before="0" w:after="0" w:line="240" w:lineRule="auto"/>
+        <w:spacing w:after="24"/>
+        <w:ind w:left="0"/>
       </w:pPr>
       <w:r>
         <w:rPr>
-          <w:rFonts w:ascii="Arial" w:hAnsi="Arial" w:eastAsia="Arial" w:cs="Arial"/>
-          <w:color w:val="1E1E1E"/>
-          <w:sz w:val="17"/>
+          <w:rFonts w:ascii="Arial" w:hAnsi="Arial"/>
+          <w:b/>
+          <w:color w:val="111111"/>
+          <w:sz w:val="18"/>
         </w:rPr>
-        <w:t>Marketing Analytics; Commercial Analytics; Business Intelligence; Data Analysis; KPI Analysis; Data Visualization; Financial Reporting; Excel; Digital Marketing; Customer Insights; Customer Journey; Local SEO; Email Marketing; Paid Social; E-Commerce; UiPath; Process Automation; Business Rules Automation; JSON; HTML Reporting; Angular; Spring Boot; REST APIs; RAG.</w:t>
+        <w:t xml:space="preserve">Marketing &amp; Commercial Analytics: </w:t>
+      </w:r>
+      <w:r>
+        <w:rPr>
+          <w:rFonts w:ascii="Arial" w:hAnsi="Arial"/>
+          <w:sz w:val="18"/>
+        </w:rPr>
+        <w:t>Marketing Analytics, Commercial Analytics, Customer Insights, Customer Journey Mapping, KPI Reporting, Digital Growth, CRM &amp; Marketing Automation</w:t>
       </w:r>
     </w:p>
     <w:p>
       <w:pPr>
-        <w:keepNext/>
-        <w:spacing w:before="100" w:after="20" w:line="240" w:lineRule="auto"/>
+        <w:spacing w:after="24"/>
+        <w:ind w:left="0"/>
       </w:pPr>
       <w:r>
         <w:rPr>
-          <w:rFonts w:ascii="Arial" w:hAnsi="Arial" w:eastAsia="Arial" w:cs="Arial"/>
+          <w:rFonts w:ascii="Arial" w:hAnsi="Arial"/>
           <w:b/>
-          <w:caps/>
-          <w:color w:val="1E1E1E"/>
-          <w:sz w:val="21"/>
+          <w:color w:val="111111"/>
+          <w:sz w:val="18"/>
         </w:rPr>
+        <w:t xml:space="preserve">Business Intelligence &amp; Data: </w:t>
+      </w:r>
+      <w:r>
+        <w:rPr>
+          <w:rFonts w:ascii="Arial" w:hAnsi="Arial"/>
+          <w:sz w:val="18"/>
+        </w:rPr>
+        <w:t>Business Intelligence, Data Analysis, Data Visualisation, Microsoft Excel, Financial Reporting, Variance Analysis, Management Reporting</w:t>
+      </w:r>
+    </w:p>
+    <w:p>
+      <w:pPr>
+        <w:spacing w:after="24"/>
+        <w:ind w:left="0"/>
+      </w:pPr>
+      <w:r>
+        <w:rPr>
+          <w:rFonts w:ascii="Arial" w:hAnsi="Arial"/>
+          <w:b/>
+          <w:color w:val="111111"/>
+          <w:sz w:val="18"/>
+        </w:rPr>
+        <w:t xml:space="preserve">Automation &amp; Business Systems: </w:t>
+      </w:r>
+      <w:r>
+        <w:rPr>
+          <w:rFonts w:ascii="Arial" w:hAnsi="Arial"/>
+          <w:sz w:val="18"/>
+        </w:rPr>
+        <w:t>UiPath, Process Mapping, Business-Rule Modelling, JSON, Python, HTML Reporting, Data Validation, Exception Management</w:t>
+      </w:r>
+    </w:p>
+    <w:p>
+      <w:pPr>
+        <w:spacing w:after="24"/>
+        <w:ind w:left="0"/>
+      </w:pPr>
+      <w:r>
+        <w:rPr>
+          <w:rFonts w:ascii="Arial" w:hAnsi="Arial"/>
+          <w:b/>
+          <w:color w:val="111111"/>
+          <w:sz w:val="18"/>
+        </w:rPr>
+        <w:t xml:space="preserve">Supporting Technical Foundations: </w:t>
+      </w:r>
+      <w:r>
+        <w:rPr>
+          <w:rFonts w:ascii="Arial" w:hAnsi="Arial"/>
+          <w:sz w:val="18"/>
+        </w:rPr>
+        <w:t>REST APIs, Firebase, Angular, Spring Boot, RAG, Docker, Kafka</w:t>
+      </w:r>
+    </w:p>
+    <w:p>
+      <w:pPr>
+        <w:pStyle w:val="Heading1"/>
+        <w:keepNext/>
+        <w:spacing w:before="120" w:after="60"/>
+      </w:pPr>
+      <w:r>
         <w:t>PROFESSIONAL EXPERIENCE</w:t>
       </w:r>
     </w:p>
     <w:p>
       <w:pPr>
         <w:keepNext/>
-        <w:spacing w:before="44" w:after="0" w:line="240" w:lineRule="auto"/>
+        <w:spacing w:before="60" w:after="0"/>
       </w:pPr>
       <w:r>
         <w:rPr>
-          <w:rFonts w:ascii="Arial" w:hAnsi="Arial" w:eastAsia="Arial" w:cs="Arial"/>
+          <w:rFonts w:ascii="Arial" w:hAnsi="Arial"/>
           <w:b/>
-          <w:color w:val="1E1E1E"/>
-          <w:sz w:val="18"/>
+          <w:color w:val="111111"/>
+          <w:sz w:val="19"/>
         </w:rPr>
-        <w:t>Sunshine Vacances France | Head of IT Services | Process Automation &amp; Business Systems</w:t>
+        <w:t>Sunshine Vacances France</w:t>
       </w:r>
     </w:p>
     <w:p>
       <w:pPr>
         <w:keepNext/>
-        <w:spacing w:before="0" w:after="0" w:line="240" w:lineRule="auto"/>
+        <w:spacing w:after="0"/>
       </w:pPr>
       <w:r>
         <w:rPr>
-          <w:rFonts w:ascii="Arial" w:hAnsi="Arial" w:eastAsia="Arial" w:cs="Arial"/>
-          <w:i/>
-          <w:color w:val="687789"/>
+          <w:rFonts w:ascii="Arial" w:hAnsi="Arial"/>
+          <w:b/>
+          <w:sz w:val="18"/>
+        </w:rPr>
+        <w:t>Head of IT Services | Process Automation &amp; Business Systems</w:t>
+      </w:r>
+      <w:r>
+        <w:rPr>
+          <w:rFonts w:ascii="Arial" w:hAnsi="Arial"/>
+          <w:color w:val="333333"/>
           <w:sz w:val="17"/>
         </w:rPr>
-        <w:t>Jul 2025 - Present | Sousse, Tunisia</w:t>
+        <w:t xml:space="preserve">  |  Jul 2025 - Present  |  Sousse, Tunisia</w:t>
       </w:r>
     </w:p>
     <w:p>
       <w:pPr>
-        <w:spacing w:before="0" w:after="0" w:line="240" w:lineRule="auto"/>
-        <w:ind w:left="202" w:hanging="173"/>
+        <w:spacing w:after="12" w:line="240" w:lineRule="auto"/>
+        <w:ind w:left="255" w:hanging="159"/>
       </w:pPr>
       <w:r>
         <w:rPr>
-          <w:rFonts w:ascii="Arial" w:hAnsi="Arial" w:eastAsia="Arial" w:cs="Arial"/>
-          <w:color w:val="1E1E1E"/>
+          <w:rFonts w:ascii="Arial" w:hAnsi="Arial"/>
           <w:sz w:val="17"/>
         </w:rPr>
-        <w:t xml:space="preserve">• </w:t>
-      </w:r>
-      <w:r>
-        <w:rPr>
-          <w:rFonts w:ascii="Arial" w:hAnsi="Arial" w:eastAsia="Arial" w:cs="Arial"/>
-          <w:color w:val="1E1E1E"/>
-          <w:sz w:val="17"/>
-        </w:rPr>
-        <w:t>Led business-process improvement initiatives for tourism operations, with a focus on automation, data reliability and auditability.</w:t>
+        <w:t>• Sole contributor responsible for IT systems, technical project delivery and process automation at Sunshine Holiday Group headquarters.</w:t>
       </w:r>
     </w:p>
     <w:p>
       <w:pPr>
-        <w:spacing w:before="0" w:after="0" w:line="240" w:lineRule="auto"/>
-        <w:ind w:left="202" w:hanging="173"/>
+        <w:spacing w:after="12" w:line="240" w:lineRule="auto"/>
+        <w:ind w:left="255" w:hanging="159"/>
       </w:pPr>
       <w:r>
         <w:rPr>
-          <w:rFonts w:ascii="Arial" w:hAnsi="Arial" w:eastAsia="Arial" w:cs="Arial"/>
-          <w:color w:val="1E1E1E"/>
+          <w:rFonts w:ascii="Arial" w:hAnsi="Arial"/>
           <w:sz w:val="17"/>
         </w:rPr>
-        <w:t xml:space="preserve">• </w:t>
+        <w:t>• Designed and operate an end-to-end UiPath workflow for invoice control, booking reconciliation and hotel commercial-rule validation across 40 hotels and four travel agencies.</w:t>
       </w:r>
+    </w:p>
+    <w:p>
+      <w:pPr>
+        <w:spacing w:after="12" w:line="240" w:lineRule="auto"/>
+        <w:ind w:left="255" w:hanging="159"/>
+      </w:pPr>
       <w:r>
         <w:rPr>
-          <w:rFonts w:ascii="Arial" w:hAnsi="Arial" w:eastAsia="Arial" w:cs="Arial"/>
-          <w:color w:val="1E1E1E"/>
+          <w:rFonts w:ascii="Arial" w:hAnsi="Arial"/>
           <w:sz w:val="17"/>
         </w:rPr>
-        <w:t>Designed and expanded a UiPath workflow for invoice validation and reconciliation across invoices, vouchers, reservations and stay-related data.</w:t>
+        <w:t>• Expanded the control scope from one month for one hotel and one agency in four working days to a full season across all supported hotels and agencies in approximately seven days.</w:t>
+      </w:r>
+    </w:p>
+    <w:p>
+      <w:pPr>
+        <w:spacing w:after="12" w:line="240" w:lineRule="auto"/>
+        <w:ind w:left="255" w:hanging="159"/>
+      </w:pPr>
+      <w:r>
+        <w:rPr>
+          <w:rFonts w:ascii="Arial" w:hAnsi="Arial"/>
+          <w:sz w:val="17"/>
+        </w:rPr>
+        <w:t>• Structure commercial rules, surface uncertain cases for human review and deliver validated control and exception reports.</w:t>
       </w:r>
     </w:p>
     <w:p>
       <w:pPr>
         <w:keepNext/>
-        <w:spacing w:before="44" w:after="0" w:line="240" w:lineRule="auto"/>
+        <w:spacing w:before="60" w:after="0"/>
       </w:pPr>
       <w:r>
         <w:rPr>
-          <w:rFonts w:ascii="Arial" w:hAnsi="Arial" w:eastAsia="Arial" w:cs="Arial"/>
+          <w:rFonts w:ascii="Arial" w:hAnsi="Arial"/>
           <w:b/>
-          <w:color w:val="1E1E1E"/>
-          <w:sz w:val="18"/>
+          <w:color w:val="111111"/>
+          <w:sz w:val="19"/>
         </w:rPr>
-        <w:t>Maison Salina | Commercial &amp; Digital Marketing Manager</w:t>
+        <w:t>Maison Salina</w:t>
       </w:r>
     </w:p>
     <w:p>
       <w:pPr>
         <w:keepNext/>
-        <w:spacing w:before="0" w:after="0" w:line="240" w:lineRule="auto"/>
+        <w:spacing w:after="0"/>
       </w:pPr>
       <w:r>
         <w:rPr>
-          <w:rFonts w:ascii="Arial" w:hAnsi="Arial" w:eastAsia="Arial" w:cs="Arial"/>
-          <w:i/>
-          <w:color w:val="687789"/>
+          <w:rFonts w:ascii="Arial" w:hAnsi="Arial"/>
+          <w:b/>
+          <w:sz w:val="18"/>
+        </w:rPr>
+        <w:t>Commercial &amp; Digital Marketing Manager</w:t>
+      </w:r>
+      <w:r>
+        <w:rPr>
+          <w:rFonts w:ascii="Arial" w:hAnsi="Arial"/>
+          <w:color w:val="333333"/>
           <w:sz w:val="17"/>
         </w:rPr>
-        <w:t>Apr 2025 - Sep 2025 | Sousse, Tunisia</w:t>
+        <w:t xml:space="preserve">  |  Apr 2025 - Sep 2025  |  Sousse, Tunisia</w:t>
       </w:r>
     </w:p>
     <w:p>
       <w:pPr>
-        <w:spacing w:before="0" w:after="0" w:line="240" w:lineRule="auto"/>
-        <w:ind w:left="202" w:hanging="173"/>
+        <w:spacing w:after="12" w:line="240" w:lineRule="auto"/>
+        <w:ind w:left="255" w:hanging="159"/>
       </w:pPr>
       <w:r>
         <w:rPr>
-          <w:rFonts w:ascii="Arial" w:hAnsi="Arial" w:eastAsia="Arial" w:cs="Arial"/>
-          <w:color w:val="1E1E1E"/>
+          <w:rFonts w:ascii="Arial" w:hAnsi="Arial"/>
           <w:sz w:val="17"/>
         </w:rPr>
-        <w:t xml:space="preserve">• </w:t>
+        <w:t>• Supported commercial planning, digital-marketing coordination, partnership outreach and initiatives to strengthen online visibility.</w:t>
       </w:r>
+    </w:p>
+    <w:p>
+      <w:pPr>
+        <w:spacing w:after="12" w:line="240" w:lineRule="auto"/>
+        <w:ind w:left="255" w:hanging="159"/>
+      </w:pPr>
       <w:r>
         <w:rPr>
-          <w:rFonts w:ascii="Arial" w:hAnsi="Arial" w:eastAsia="Arial" w:cs="Arial"/>
-          <w:color w:val="1E1E1E"/>
+          <w:rFonts w:ascii="Arial" w:hAnsi="Arial"/>
           <w:sz w:val="17"/>
         </w:rPr>
-        <w:t>Led commercial and digital initiatives for a long-established home-furnishing business, supporting visibility, customer engagement and growth.</w:t>
+        <w:t>• Monitored qualitative campaign and commercial feedback to support communication adjustments and business-development activities.</w:t>
       </w:r>
     </w:p>
     <w:p>
       <w:pPr>
         <w:keepNext/>
-        <w:spacing w:before="44" w:after="0" w:line="240" w:lineRule="auto"/>
+        <w:spacing w:before="60" w:after="0"/>
       </w:pPr>
       <w:r>
         <w:rPr>
-          <w:rFonts w:ascii="Arial" w:hAnsi="Arial" w:eastAsia="Arial" w:cs="Arial"/>
+          <w:rFonts w:ascii="Arial" w:hAnsi="Arial"/>
           <w:b/>
-          <w:color w:val="1E1E1E"/>
-          <w:sz w:val="18"/>
+          <w:color w:val="111111"/>
+          <w:sz w:val="19"/>
         </w:rPr>
-        <w:t>Confidential Client - Men's Barbershop, France | Digital Marketing &amp; Automation Consultant</w:t>
+        <w:t>Chic-Chac - Men's Barbershop, France</w:t>
       </w:r>
     </w:p>
     <w:p>
       <w:pPr>
         <w:keepNext/>
-        <w:spacing w:before="0" w:after="0" w:line="240" w:lineRule="auto"/>
+        <w:spacing w:after="0"/>
       </w:pPr>
       <w:r>
         <w:rPr>
-          <w:rFonts w:ascii="Arial" w:hAnsi="Arial" w:eastAsia="Arial" w:cs="Arial"/>
-          <w:i/>
-          <w:color w:val="687789"/>
+          <w:rFonts w:ascii="Arial" w:hAnsi="Arial"/>
+          <w:b/>
+          <w:sz w:val="18"/>
+        </w:rPr>
+        <w:t>Freelance Digital Transformation &amp; Data-Driven Marketing Consultant</w:t>
+      </w:r>
+      <w:r>
+        <w:rPr>
+          <w:rFonts w:ascii="Arial" w:hAnsi="Arial"/>
+          <w:color w:val="333333"/>
           <w:sz w:val="17"/>
         </w:rPr>
-        <w:t>Feb 2025 - Jul 2025 | Noisy-le-Grand, France</w:t>
+        <w:t xml:space="preserve">  |  Feb 2025 - Jul 2025  |  Noisy-le-Grand, France</w:t>
       </w:r>
     </w:p>
     <w:p>
       <w:pPr>
-        <w:spacing w:before="0" w:after="0" w:line="240" w:lineRule="auto"/>
-        <w:ind w:left="202" w:hanging="173"/>
+        <w:spacing w:after="12" w:line="240" w:lineRule="auto"/>
+        <w:ind w:left="255" w:hanging="159"/>
       </w:pPr>
       <w:r>
         <w:rPr>
-          <w:rFonts w:ascii="Arial" w:hAnsi="Arial" w:eastAsia="Arial" w:cs="Arial"/>
-          <w:color w:val="1E1E1E"/>
+          <w:rFonts w:ascii="Arial" w:hAnsi="Arial"/>
           <w:sz w:val="17"/>
         </w:rPr>
-        <w:t xml:space="preserve">• </w:t>
+        <w:t>• Delivered a paid project comprising a customer-facing booking website built with HTML, CSS, JavaScript and Firebase, plus a separate Angular and Spring Boot administration dashboard.</w:t>
       </w:r>
+    </w:p>
+    <w:p>
+      <w:pPr>
+        <w:spacing w:after="12" w:line="240" w:lineRule="auto"/>
+        <w:ind w:left="255" w:hanging="159"/>
+      </w:pPr>
       <w:r>
         <w:rPr>
-          <w:rFonts w:ascii="Arial" w:hAnsi="Arial" w:eastAsia="Arial" w:cs="Arial"/>
-          <w:color w:val="1E1E1E"/>
+          <w:rFonts w:ascii="Arial" w:hAnsi="Arial"/>
           <w:sz w:val="17"/>
         </w:rPr>
-        <w:t>Led a digital transformation project focused on online visibility, booking experience and digital customer communication.</w:t>
+        <w:t>• Generated more than 3,000 Google Search impressions over 90 days and approximately 30 online reservations during the first month.</w:t>
+      </w:r>
+    </w:p>
+    <w:p>
+      <w:r>
+        <w:br w:type="page"/>
+      </w:r>
+    </w:p>
+    <w:p>
+      <w:pPr>
+        <w:pStyle w:val="Heading1"/>
+        <w:keepNext/>
+        <w:spacing w:before="120" w:after="60"/>
+      </w:pPr>
+      <w:r>
+        <w:t>PROFESSIONAL EXPERIENCE (CONTINUED)</w:t>
       </w:r>
     </w:p>
     <w:p>
       <w:pPr>
         <w:keepNext/>
-        <w:spacing w:before="44" w:after="0" w:line="240" w:lineRule="auto"/>
+        <w:spacing w:before="60" w:after="0"/>
       </w:pPr>
       <w:r>
         <w:rPr>
-          <w:rFonts w:ascii="Arial" w:hAnsi="Arial" w:eastAsia="Arial" w:cs="Arial"/>
+          <w:rFonts w:ascii="Arial" w:hAnsi="Arial"/>
           <w:b/>
-          <w:color w:val="1E1E1E"/>
-          <w:sz w:val="18"/>
+          <w:color w:val="111111"/>
+          <w:sz w:val="19"/>
         </w:rPr>
-        <w:t>VERMEG for Banking &amp; Insurance Software | AI &amp; Full-Stack Development Intern</w:t>
+        <w:t>VERMEG for Banking &amp; Insurance Software</w:t>
       </w:r>
     </w:p>
     <w:p>
       <w:pPr>
         <w:keepNext/>
-        <w:spacing w:before="0" w:after="0" w:line="240" w:lineRule="auto"/>
+        <w:spacing w:after="0"/>
       </w:pPr>
       <w:r>
         <w:rPr>
-          <w:rFonts w:ascii="Arial" w:hAnsi="Arial" w:eastAsia="Arial" w:cs="Arial"/>
-          <w:i/>
-          <w:color w:val="687789"/>
+          <w:rFonts w:ascii="Arial" w:hAnsi="Arial"/>
+          <w:b/>
+          <w:sz w:val="18"/>
+        </w:rPr>
+        <w:t>AI &amp; Full-Stack Development Intern</w:t>
+      </w:r>
+      <w:r>
+        <w:rPr>
+          <w:rFonts w:ascii="Arial" w:hAnsi="Arial"/>
+          <w:color w:val="333333"/>
           <w:sz w:val="17"/>
         </w:rPr>
-        <w:t>Feb 2025 - May 2025 | Tunis, Tunisia</w:t>
+        <w:t xml:space="preserve">  |  Feb 2025 - May 2025  |  Tunis, Tunisia</w:t>
       </w:r>
     </w:p>
     <w:p>
       <w:pPr>
-        <w:spacing w:before="0" w:after="0" w:line="240" w:lineRule="auto"/>
-        <w:ind w:left="202" w:hanging="173"/>
+        <w:spacing w:after="12" w:line="240" w:lineRule="auto"/>
+        <w:ind w:left="255" w:hanging="159"/>
       </w:pPr>
       <w:r>
         <w:rPr>
-          <w:rFonts w:ascii="Arial" w:hAnsi="Arial" w:eastAsia="Arial" w:cs="Arial"/>
-          <w:color w:val="1E1E1E"/>
+          <w:rFonts w:ascii="Arial" w:hAnsi="Arial"/>
           <w:sz w:val="17"/>
         </w:rPr>
-        <w:t xml:space="preserve">• </w:t>
-      </w:r>
-      <w:r>
-        <w:rPr>
-          <w:rFonts w:ascii="Arial" w:hAnsi="Arial" w:eastAsia="Arial" w:cs="Arial"/>
-          <w:color w:val="1E1E1E"/>
-          <w:sz w:val="17"/>
-        </w:rPr>
-        <w:t>Contributed to a secure, scalable and multilingual e-learning platform with enrolment, progress tracking, dashboards, event booking and real-time notifications.</w:t>
+        <w:t>• Co-developed a demonstrable AI-ready e-learning prototype in a two-person team; focused on chatbot functionality and selected application services.</w:t>
       </w:r>
     </w:p>
     <w:p>
       <w:pPr>
-        <w:spacing w:before="0" w:after="0" w:line="240" w:lineRule="auto"/>
-        <w:ind w:left="202" w:hanging="173"/>
+        <w:spacing w:after="12" w:line="240" w:lineRule="auto"/>
+        <w:ind w:left="255" w:hanging="159"/>
       </w:pPr>
       <w:r>
         <w:rPr>
-          <w:rFonts w:ascii="Arial" w:hAnsi="Arial" w:eastAsia="Arial" w:cs="Arial"/>
-          <w:color w:val="1E1E1E"/>
+          <w:rFonts w:ascii="Arial" w:hAnsi="Arial"/>
           <w:sz w:val="17"/>
         </w:rPr>
-        <w:t xml:space="preserve">• </w:t>
-      </w:r>
-      <w:r>
-        <w:rPr>
-          <w:rFonts w:ascii="Arial" w:hAnsi="Arial" w:eastAsia="Arial" w:cs="Arial"/>
-          <w:color w:val="1E1E1E"/>
-          <w:sz w:val="17"/>
-        </w:rPr>
-        <w:t>Integrated a locally deployed LLaMA 3.2 assistant through Ollama with RAG-based PDF and CSV knowledge retrieval; contributed to microservices, monitoring and security safeguards.</w:t>
+        <w:t>• Applied Angular, Spring Boot, Ollama and RAG concepts and contributed to integration, secure access, event-driven communication, containerisation and observability concepts. Prototype only; not deployed to production.</w:t>
       </w:r>
     </w:p>
     <w:p>
       <w:pPr>
         <w:keepNext/>
-        <w:spacing w:before="44" w:after="0" w:line="240" w:lineRule="auto"/>
+        <w:spacing w:before="60" w:after="0"/>
       </w:pPr>
       <w:r>
         <w:rPr>
-          <w:rFonts w:ascii="Arial" w:hAnsi="Arial" w:eastAsia="Arial" w:cs="Arial"/>
+          <w:rFonts w:ascii="Arial" w:hAnsi="Arial"/>
           <w:b/>
-          <w:color w:val="1E1E1E"/>
-          <w:sz w:val="18"/>
+          <w:color w:val="111111"/>
+          <w:sz w:val="19"/>
         </w:rPr>
-        <w:t>El Mouradi Hotels | Management Controller</w:t>
+        <w:t>El Mouradi Hotels</w:t>
       </w:r>
     </w:p>
     <w:p>
       <w:pPr>
         <w:keepNext/>
-        <w:spacing w:before="0" w:after="0" w:line="240" w:lineRule="auto"/>
+        <w:spacing w:after="0"/>
       </w:pPr>
       <w:r>
         <w:rPr>
-          <w:rFonts w:ascii="Arial" w:hAnsi="Arial" w:eastAsia="Arial" w:cs="Arial"/>
-          <w:i/>
-          <w:color w:val="687789"/>
+          <w:rFonts w:ascii="Arial" w:hAnsi="Arial"/>
+          <w:b/>
+          <w:sz w:val="18"/>
+        </w:rPr>
+        <w:t>Management Controller</w:t>
+      </w:r>
+      <w:r>
+        <w:rPr>
+          <w:rFonts w:ascii="Arial" w:hAnsi="Arial"/>
+          <w:color w:val="333333"/>
           <w:sz w:val="17"/>
         </w:rPr>
-        <w:t>Jul 2024 - Sep 2024 | Sousse, Tunisia</w:t>
+        <w:t xml:space="preserve">  |  Jul 2024 - Sep 2024  |  Sousse, Tunisia</w:t>
       </w:r>
     </w:p>
     <w:p>
       <w:pPr>
-        <w:spacing w:before="0" w:after="0" w:line="240" w:lineRule="auto"/>
-        <w:ind w:left="202" w:hanging="173"/>
+        <w:spacing w:after="12" w:line="240" w:lineRule="auto"/>
+        <w:ind w:left="255" w:hanging="159"/>
       </w:pPr>
       <w:r>
         <w:rPr>
-          <w:rFonts w:ascii="Arial" w:hAnsi="Arial" w:eastAsia="Arial" w:cs="Arial"/>
-          <w:color w:val="1E1E1E"/>
+          <w:rFonts w:ascii="Arial" w:hAnsi="Arial"/>
           <w:sz w:val="17"/>
         </w:rPr>
-        <w:t xml:space="preserve">• </w:t>
+        <w:t>• Produced or contributed to four daily and three monthly reports or analyses covering operational departments.</w:t>
       </w:r>
+    </w:p>
+    <w:p>
+      <w:pPr>
+        <w:spacing w:after="12" w:line="240" w:lineRule="auto"/>
+        <w:ind w:left="255" w:hanging="159"/>
+      </w:pPr>
       <w:r>
         <w:rPr>
-          <w:rFonts w:ascii="Arial" w:hAnsi="Arial" w:eastAsia="Arial" w:cs="Arial"/>
-          <w:color w:val="1E1E1E"/>
+          <w:rFonts w:ascii="Arial" w:hAnsi="Arial"/>
           <w:sz w:val="17"/>
         </w:rPr>
-        <w:t>Analysed occupancy, operational costs and revenue-related KPIs; contributed to budget preparation, variance analysis and financial reporting.</w:t>
+        <w:t>• Supported budget preparation, KPI reporting, variance analysis, cost control and management decision support.</w:t>
       </w:r>
     </w:p>
     <w:p>
       <w:pPr>
         <w:keepNext/>
-        <w:spacing w:before="44" w:after="0" w:line="240" w:lineRule="auto"/>
+        <w:spacing w:before="60" w:after="0"/>
       </w:pPr>
       <w:r>
         <w:rPr>
-          <w:rFonts w:ascii="Arial" w:hAnsi="Arial" w:eastAsia="Arial" w:cs="Arial"/>
+          <w:rFonts w:ascii="Arial" w:hAnsi="Arial"/>
           <w:b/>
-          <w:color w:val="1E1E1E"/>
-          <w:sz w:val="18"/>
+          <w:color w:val="111111"/>
+          <w:sz w:val="19"/>
         </w:rPr>
-        <w:t>ArabSoft | Full-Stack Development Intern</w:t>
+        <w:t>ArabSoft</w:t>
       </w:r>
     </w:p>
     <w:p>
       <w:pPr>
         <w:keepNext/>
-        <w:spacing w:before="0" w:after="0" w:line="240" w:lineRule="auto"/>
+        <w:spacing w:after="0"/>
       </w:pPr>
       <w:r>
         <w:rPr>
-          <w:rFonts w:ascii="Arial" w:hAnsi="Arial" w:eastAsia="Arial" w:cs="Arial"/>
-          <w:i/>
-          <w:color w:val="687789"/>
+          <w:rFonts w:ascii="Arial" w:hAnsi="Arial"/>
+          <w:b/>
+          <w:sz w:val="18"/>
+        </w:rPr>
+        <w:t>Full-Stack Development Intern</w:t>
+      </w:r>
+      <w:r>
+        <w:rPr>
+          <w:rFonts w:ascii="Arial" w:hAnsi="Arial"/>
+          <w:color w:val="333333"/>
           <w:sz w:val="17"/>
         </w:rPr>
-        <w:t>Jun 2024 - Aug 2024 | Tunis, Tunisia</w:t>
+        <w:t xml:space="preserve">  |  Jun 2024 - Aug 2024  |  Tunis, Tunisia</w:t>
       </w:r>
     </w:p>
     <w:p>
       <w:pPr>
-        <w:spacing w:before="0" w:after="0" w:line="240" w:lineRule="auto"/>
-        <w:ind w:left="202" w:hanging="173"/>
+        <w:spacing w:after="12" w:line="240" w:lineRule="auto"/>
+        <w:ind w:left="255" w:hanging="159"/>
       </w:pPr>
       <w:r>
         <w:rPr>
-          <w:rFonts w:ascii="Arial" w:hAnsi="Arial" w:eastAsia="Arial" w:cs="Arial"/>
-          <w:color w:val="1E1E1E"/>
+          <w:rFonts w:ascii="Arial" w:hAnsi="Arial"/>
           <w:sz w:val="17"/>
         </w:rPr>
-        <w:t xml:space="preserve">• </w:t>
+        <w:t>• Built a functional library-management application with Angular, Spring Boot, REST APIs and a relational database.</w:t>
       </w:r>
+    </w:p>
+    <w:p>
+      <w:pPr>
+        <w:spacing w:after="12" w:line="240" w:lineRule="auto"/>
+        <w:ind w:left="255" w:hanging="159"/>
+      </w:pPr>
       <w:r>
         <w:rPr>
-          <w:rFonts w:ascii="Arial" w:hAnsi="Arial" w:eastAsia="Arial" w:cs="Arial"/>
-          <w:color w:val="1E1E1E"/>
+          <w:rFonts w:ascii="Arial" w:hAnsi="Arial"/>
           <w:sz w:val="17"/>
         </w:rPr>
-        <w:t>Built a full-stack library-management application using Angular, Spring Boot, REST APIs and relational databases.</w:t>
+        <w:t>• Implemented CRUD operations, search, validation and borrowing tracking.</w:t>
       </w:r>
     </w:p>
     <w:p>
       <w:pPr>
         <w:keepNext/>
-        <w:spacing w:before="44" w:after="0" w:line="240" w:lineRule="auto"/>
+        <w:spacing w:before="60" w:after="0"/>
       </w:pPr>
       <w:r>
         <w:rPr>
-          <w:rFonts w:ascii="Arial" w:hAnsi="Arial" w:eastAsia="Arial" w:cs="Arial"/>
+          <w:rFonts w:ascii="Arial" w:hAnsi="Arial"/>
           <w:b/>
-          <w:color w:val="1E1E1E"/>
-          <w:sz w:val="18"/>
+          <w:color w:val="111111"/>
+          <w:sz w:val="19"/>
         </w:rPr>
-        <w:t>El Mouradi Hotels | Management Control Intern</w:t>
+        <w:t>El Mouradi Hotels</w:t>
       </w:r>
     </w:p>
     <w:p>
       <w:pPr>
         <w:keepNext/>
-        <w:spacing w:before="0" w:after="0" w:line="240" w:lineRule="auto"/>
+        <w:spacing w:after="0"/>
       </w:pPr>
       <w:r>
         <w:rPr>
-          <w:rFonts w:ascii="Arial" w:hAnsi="Arial" w:eastAsia="Arial" w:cs="Arial"/>
-          <w:i/>
-          <w:color w:val="687789"/>
+          <w:rFonts w:ascii="Arial" w:hAnsi="Arial"/>
+          <w:b/>
+          <w:sz w:val="18"/>
+        </w:rPr>
+        <w:t>Management Control Intern</w:t>
+      </w:r>
+      <w:r>
+        <w:rPr>
+          <w:rFonts w:ascii="Arial" w:hAnsi="Arial"/>
+          <w:color w:val="333333"/>
           <w:sz w:val="17"/>
         </w:rPr>
-        <w:t>Jun 2023 - Sep 2023 | Sousse, Tunisia</w:t>
+        <w:t xml:space="preserve">  |  Jun 2023 - Sep 2023  |  Sousse, Tunisia</w:t>
       </w:r>
     </w:p>
     <w:p>
       <w:pPr>
-        <w:spacing w:before="0" w:after="0" w:line="240" w:lineRule="auto"/>
-        <w:ind w:left="202" w:hanging="173"/>
+        <w:spacing w:after="12" w:line="240" w:lineRule="auto"/>
+        <w:ind w:left="255" w:hanging="159"/>
       </w:pPr>
       <w:r>
         <w:rPr>
-          <w:rFonts w:ascii="Arial" w:hAnsi="Arial" w:eastAsia="Arial" w:cs="Arial"/>
-          <w:color w:val="1E1E1E"/>
+          <w:rFonts w:ascii="Arial" w:hAnsi="Arial"/>
           <w:sz w:val="17"/>
         </w:rPr>
-        <w:t xml:space="preserve">• </w:t>
+        <w:t>• Analysed expenses, operational indicators and budget variances and supported financial reporting, KPI monitoring and cost-control activities.</w:t>
       </w:r>
+    </w:p>
+    <w:p>
+      <w:pPr>
+        <w:pStyle w:val="Heading1"/>
+        <w:keepNext/>
+        <w:spacing w:before="120" w:after="60"/>
+      </w:pPr>
       <w:r>
-        <w:rPr>
-          <w:rFonts w:ascii="Arial" w:hAnsi="Arial" w:eastAsia="Arial" w:cs="Arial"/>
-          <w:color w:val="1E1E1E"/>
-          <w:sz w:val="17"/>
-        </w:rPr>
-        <w:t>Analysed expenses, operational indicators and budget variances; supported financial reporting, cost-control initiatives and KPI monitoring.</w:t>
+        <w:t>SELECTED PROJECTS</w:t>
       </w:r>
     </w:p>
     <w:p>
       <w:pPr>
         <w:keepNext/>
-        <w:spacing w:before="100" w:after="20" w:line="240" w:lineRule="auto"/>
+        <w:spacing w:before="40" w:after="0"/>
       </w:pPr>
       <w:r>
         <w:rPr>
-          <w:rFonts w:ascii="Arial" w:hAnsi="Arial" w:eastAsia="Arial" w:cs="Arial"/>
+          <w:rFonts w:ascii="Arial" w:hAnsi="Arial"/>
           <w:b/>
-          <w:caps/>
-          <w:color w:val="1E1E1E"/>
-          <w:sz w:val="21"/>
+          <w:color w:val="111111"/>
+          <w:sz w:val="18"/>
         </w:rPr>
-        <w:t>SELECTED PROJECTS</w:t>
+        <w:t>TuniCulture - Tunisia Excursion Booking Platform</w:t>
       </w:r>
     </w:p>
     <w:p>
       <w:pPr>
-        <w:spacing w:before="0" w:after="0" w:line="240" w:lineRule="auto"/>
+        <w:spacing w:after="24" w:line="240" w:lineRule="auto"/>
       </w:pPr>
       <w:r>
         <w:rPr>
-          <w:rFonts w:ascii="Arial" w:hAnsi="Arial" w:eastAsia="Arial" w:cs="Arial"/>
-          <w:b/>
-          <w:color w:val="1E1E1E"/>
+          <w:rFonts w:ascii="Arial" w:hAnsi="Arial"/>
           <w:sz w:val="17"/>
         </w:rPr>
-        <w:t xml:space="preserve">RPA for Invoice Control &amp; Booking Reconciliation: </w:t>
-      </w:r>
-      <w:r>
-        <w:rPr>
-          <w:rFonts w:ascii="Arial" w:hAnsi="Arial" w:eastAsia="Arial" w:cs="Arial"/>
-          <w:color w:val="1E1E1E"/>
-          <w:sz w:val="17"/>
-        </w:rPr>
-        <w:t>UiPath workflow that links invoice data, vouchers, reservations and business rules to create a more structured and auditable control process.</w:t>
-      </w:r>
-    </w:p>
-    <w:p>
-      <w:pPr>
-        <w:spacing w:before="0" w:after="0" w:line="240" w:lineRule="auto"/>
-      </w:pPr>
-      <w:r>
-        <w:rPr>
-          <w:rFonts w:ascii="Arial" w:hAnsi="Arial" w:eastAsia="Arial" w:cs="Arial"/>
-          <w:b/>
-          <w:color w:val="1E1E1E"/>
-          <w:sz w:val="17"/>
-        </w:rPr>
-        <w:t xml:space="preserve">Digital Transformation for a Men's Barbershop: </w:t>
-      </w:r>
-      <w:r>
-        <w:rPr>
-          <w:rFonts w:ascii="Arial" w:hAnsi="Arial" w:eastAsia="Arial" w:cs="Arial"/>
-          <w:color w:val="1E1E1E"/>
-          <w:sz w:val="17"/>
-        </w:rPr>
-        <w:t>Website, online booking, local SEO, social content and customer communication designed around a smoother digital journey.</w:t>
-      </w:r>
-    </w:p>
-    <w:p>
-      <w:pPr>
-        <w:spacing w:before="0" w:after="0" w:line="240" w:lineRule="auto"/>
-      </w:pPr>
-      <w:r>
-        <w:rPr>
-          <w:rFonts w:ascii="Arial" w:hAnsi="Arial" w:eastAsia="Arial" w:cs="Arial"/>
-          <w:b/>
-          <w:color w:val="1E1E1E"/>
-          <w:sz w:val="17"/>
-        </w:rPr>
-        <w:t xml:space="preserve">AI-Ready E-Learning Platform: </w:t>
-      </w:r>
-      <w:r>
-        <w:rPr>
-          <w:rFonts w:ascii="Arial" w:hAnsi="Arial" w:eastAsia="Arial" w:cs="Arial"/>
-          <w:color w:val="1E1E1E"/>
-          <w:sz w:val="17"/>
-        </w:rPr>
-        <w:t>Secure, multilingual e-learning platform contribution with dashboards, microservices, local LLaMA 3.2 deployment and RAG-based knowledge retrieval.</w:t>
+        <w:t>Developed a functional customer booking journey and an administration interface with secure access, KPI visibility, reservation statuses, search, filters and Firebase data management.</w:t>
       </w:r>
     </w:p>
     <w:p>
       <w:pPr>
         <w:keepNext/>
-        <w:spacing w:before="100" w:after="20" w:line="240" w:lineRule="auto"/>
+        <w:spacing w:before="40" w:after="0"/>
       </w:pPr>
       <w:r>
         <w:rPr>
-          <w:rFonts w:ascii="Arial" w:hAnsi="Arial" w:eastAsia="Arial" w:cs="Arial"/>
+          <w:rFonts w:ascii="Arial" w:hAnsi="Arial"/>
           <w:b/>
-          <w:caps/>
-          <w:color w:val="1E1E1E"/>
-          <w:sz w:val="21"/>
+          <w:color w:val="111111"/>
+          <w:sz w:val="18"/>
         </w:rPr>
-        <w:t>EDUCATION &amp; CERTIFICATION</w:t>
+        <w:t>University Services Chatbot - IHEC Hackathon</w:t>
       </w:r>
     </w:p>
     <w:p>
       <w:pPr>
-        <w:spacing w:before="0" w:after="0" w:line="240" w:lineRule="auto"/>
+        <w:spacing w:after="24" w:line="240" w:lineRule="auto"/>
       </w:pPr>
       <w:r>
         <w:rPr>
-          <w:rFonts w:ascii="Arial" w:hAnsi="Arial" w:eastAsia="Arial" w:cs="Arial"/>
-          <w:color w:val="1E1E1E"/>
+          <w:rFonts w:ascii="Arial" w:hAnsi="Arial"/>
           <w:sz w:val="17"/>
         </w:rPr>
-        <w:t>Master's Degree - Big Data Analytics &amp; E-Commerce | IHEC Carthage | Oct 2025 - Jun 2027 | Expected graduation: June 2027</w:t>
+        <w:t>Co-developed a chatbot for student and staff information, with attention to data protection, application security and preparation for local deployment.</w:t>
       </w:r>
     </w:p>
     <w:p>
       <w:pPr>
-        <w:spacing w:before="0" w:after="0" w:line="240" w:lineRule="auto"/>
+        <w:pStyle w:val="Heading1"/>
+        <w:keepNext/>
+        <w:spacing w:before="120" w:after="60"/>
       </w:pPr>
       <w:r>
-        <w:rPr>
-          <w:rFonts w:ascii="Arial" w:hAnsi="Arial" w:eastAsia="Arial" w:cs="Arial"/>
-          <w:color w:val="1E1E1E"/>
-          <w:sz w:val="17"/>
-        </w:rPr>
-        <w:t>Bachelor's Degree - Business Intelligence | IHEC Carthage | Jan 2021 - Jun 2025</w:t>
+        <w:t>EDUCATION</w:t>
       </w:r>
     </w:p>
     <w:p>
       <w:pPr>
-        <w:spacing w:before="0" w:after="0" w:line="240" w:lineRule="auto"/>
+        <w:keepNext/>
+        <w:spacing w:before="40" w:after="0"/>
       </w:pPr>
       <w:r>
         <w:rPr>
-          <w:rFonts w:ascii="Arial" w:hAnsi="Arial" w:eastAsia="Arial" w:cs="Arial"/>
-          <w:color w:val="1E1E1E"/>
+          <w:rFonts w:ascii="Arial" w:hAnsi="Arial"/>
+          <w:b/>
+          <w:color w:val="111111"/>
+          <w:sz w:val="18"/>
+        </w:rPr>
+        <w:t>Master's Degree - Big Data Analytics &amp; E-Commerce</w:t>
+      </w:r>
+      <w:r>
+        <w:rPr>
+          <w:rFonts w:ascii="Arial" w:hAnsi="Arial"/>
+          <w:color w:val="333333"/>
           <w:sz w:val="17"/>
         </w:rPr>
-        <w:t>Certification: Fundamentals of Digital Marketing - Google | Languages: French, English</w:t>
+        <w:t xml:space="preserve">  |  IHEC Carthage  |  Oct 2025 - Jun 2027 | Expected graduation: Jun 2027</w:t>
+      </w:r>
+    </w:p>
+    <w:p>
+      <w:pPr>
+        <w:keepNext/>
+        <w:spacing w:before="40" w:after="0"/>
+      </w:pPr>
+      <w:r>
+        <w:rPr>
+          <w:rFonts w:ascii="Arial" w:hAnsi="Arial"/>
+          <w:b/>
+          <w:color w:val="111111"/>
+          <w:sz w:val="18"/>
+        </w:rPr>
+        <w:t>Bachelor's Degree - Business Intelligence</w:t>
+      </w:r>
+      <w:r>
+        <w:rPr>
+          <w:rFonts w:ascii="Arial" w:hAnsi="Arial"/>
+          <w:color w:val="333333"/>
+          <w:sz w:val="17"/>
+        </w:rPr>
+        <w:t xml:space="preserve">  |  IHEC Carthage  |  Jan 2021 - Jun 2025 | Excellent distinction, 19.5/20</w:t>
+      </w:r>
+    </w:p>
+    <w:p>
+      <w:pPr>
+        <w:pStyle w:val="Heading1"/>
+        <w:keepNext/>
+        <w:spacing w:before="120" w:after="60"/>
+      </w:pPr>
+      <w:r>
+        <w:t>CERTIFICATION, LANGUAGES &amp; VOLUNTEERING</w:t>
+      </w:r>
+    </w:p>
+    <w:p>
+      <w:pPr>
+        <w:spacing w:after="24"/>
+        <w:ind w:left="0"/>
+      </w:pPr>
+      <w:r>
+        <w:rPr>
+          <w:rFonts w:ascii="Arial" w:hAnsi="Arial"/>
+          <w:b/>
+          <w:color w:val="111111"/>
+          <w:sz w:val="18"/>
+        </w:rPr>
+        <w:t xml:space="preserve">Certification: </w:t>
+      </w:r>
+      <w:r>
+        <w:rPr>
+          <w:rFonts w:ascii="Arial" w:hAnsi="Arial"/>
+          <w:sz w:val="18"/>
+        </w:rPr>
+        <w:t>Fundamentals of Digital Marketing - Google Digital Garage, Sep 2022</w:t>
+      </w:r>
+    </w:p>
+    <w:p>
+      <w:pPr>
+        <w:spacing w:after="24"/>
+        <w:ind w:left="0"/>
+      </w:pPr>
+      <w:r>
+        <w:rPr>
+          <w:rFonts w:ascii="Arial" w:hAnsi="Arial"/>
+          <w:b/>
+          <w:color w:val="111111"/>
+          <w:sz w:val="18"/>
+        </w:rPr>
+        <w:t xml:space="preserve">Languages: </w:t>
+      </w:r>
+      <w:r>
+        <w:rPr>
+          <w:rFonts w:ascii="Arial" w:hAnsi="Arial"/>
+          <w:sz w:val="18"/>
+        </w:rPr>
+        <w:t>Arabic - Native/Bilingual, French - Professional Working Proficiency, English - Professional Working Proficiency</w:t>
+      </w:r>
+    </w:p>
+    <w:p>
+      <w:pPr>
+        <w:spacing w:after="24"/>
+        <w:ind w:left="0"/>
+      </w:pPr>
+      <w:r>
+        <w:rPr>
+          <w:rFonts w:ascii="Arial" w:hAnsi="Arial"/>
+          <w:b/>
+          <w:color w:val="111111"/>
+          <w:sz w:val="18"/>
+        </w:rPr>
+        <w:t xml:space="preserve">Volunteering: </w:t>
+      </w:r>
+      <w:r>
+        <w:rPr>
+          <w:rFonts w:ascii="Arial" w:hAnsi="Arial"/>
+          <w:sz w:val="18"/>
+        </w:rPr>
+        <w:t>AIESEC Tunisia, Outgoing Global Volunteer Member, Feb-May 2022</w:t>
       </w:r>
     </w:p>
     <w:sectPr>
-      <w:headerReference w:type="default" r:id="rId9"/>
-      <w:footerReference w:type="default" r:id="rId10"/>
-      <w:pgSz w:w="12240" w:h="15840"/>
-      <w:pgMar w:top="562" w:right="778" w:bottom="490" w:left="778" w:header="230" w:footer="288" w:gutter="0"/>
+      <w:pgSz w:w="11906" w:h="16838"/>
+      <w:pgMar w:top="709" w:right="765" w:bottom="652" w:left="765" w:header="255" w:footer="255" w:gutter="0"/>
       <w:cols w:space="720"/>
       <w:docGrid w:linePitch="360"/>
     </w:sectPr>
   </w:body>
 </w:document>
-</file>
-
-<file path=word/footer1.xml><?xml version="1.0" encoding="utf-8"?>
-<w:ftr xmlns:m="http://schemas.openxmlformats.org/officeDocument/2006/math" xmlns:mc="http://schemas.openxmlformats.org/markup-compatibility/2006" xmlns:mo="http://schemas.microsoft.com/office/mac/office/2008/main" xmlns:mv="urn:schemas-microsoft-com:mac:vml" xmlns:o="urn:schemas-microsoft-com:office:office" xmlns:r="http://schemas.openxmlformats.org/officeDocument/2006/relationships" xmlns:v="urn:schemas-microsoft-com:vml" xmlns:w10="urn:schemas-microsoft-com:office:word" xmlns:w14="http://schemas.microsoft.com/office/word/2010/wordml" xmlns:w="http://schemas.openxmlformats.org/wordprocessingml/2006/main" xmlns:wne="http://schemas.microsoft.com/office/word/2006/wordml" xmlns:wp14="http://schemas.microsoft.com/office/word/2010/wordprocessingDrawing" xmlns:wp="http://schemas.openxmlformats.org/drawingml/2006/wordprocessingDrawing" xmlns:wpc="http://schemas.microsoft.com/office/word/2010/wordprocessingCanvas" xmlns:wpg="http://schemas.microsoft.com/office/word/2010/wordprocessingGroup" xmlns:wpi="http://schemas.microsoft.com/office/word/2010/wordprocessingInk" xmlns:wps="http://schemas.microsoft.com/office/word/2010/wordprocessingShape" mc:Ignorable="w14 wp14">
-  <w:p>
-    <w:pPr>
-      <w:pStyle w:val="Footer"/>
-    </w:pPr>
-  </w:p>
-</w:ftr>
-</file>
-
-<file path=word/header1.xml><?xml version="1.0" encoding="utf-8"?>
-<w:hdr xmlns:m="http://schemas.openxmlformats.org/officeDocument/2006/math" xmlns:mc="http://schemas.openxmlformats.org/markup-compatibility/2006" xmlns:mo="http://schemas.microsoft.com/office/mac/office/2008/main" xmlns:mv="urn:schemas-microsoft-com:mac:vml" xmlns:o="urn:schemas-microsoft-com:office:office" xmlns:r="http://schemas.openxmlformats.org/officeDocument/2006/relationships" xmlns:v="urn:schemas-microsoft-com:vml" xmlns:w10="urn:schemas-microsoft-com:office:word" xmlns:w14="http://schemas.microsoft.com/office/word/2010/wordml" xmlns:w="http://schemas.openxmlformats.org/wordprocessingml/2006/main" xmlns:wne="http://schemas.microsoft.com/office/word/2006/wordml" xmlns:wp14="http://schemas.microsoft.com/office/word/2010/wordprocessingDrawing" xmlns:wp="http://schemas.openxmlformats.org/drawingml/2006/wordprocessingDrawing" xmlns:wpc="http://schemas.microsoft.com/office/word/2010/wordprocessingCanvas" xmlns:wpg="http://schemas.microsoft.com/office/word/2010/wordprocessingGroup" xmlns:wpi="http://schemas.microsoft.com/office/word/2010/wordprocessingInk" xmlns:wps="http://schemas.microsoft.com/office/word/2010/wordprocessingShape" mc:Ignorable="w14 wp14">
-  <w:p>
-    <w:pPr>
-      <w:pStyle w:val="Header"/>
-    </w:pPr>
-  </w:p>
-</w:hdr>
 </file>
 
 <file path=word/numbering.xml><?xml version="1.0" encoding="utf-8"?>
@@ -1061,12 +1277,12 @@
     <w:qFormat/>
     <w:rsid w:val="00FC693F"/>
     <w:pPr>
-      <w:spacing w:after="0" w:line="240" w:lineRule="auto"/>
+      <w:spacing w:after="0" w:line="245" w:lineRule="auto"/>
     </w:pPr>
     <w:rPr>
-      <w:rFonts w:ascii="Arial" w:hAnsi="Arial" w:eastAsia="Arial"/>
-      <w:color w:val="1E1E1E"/>
-      <w:sz w:val="17"/>
+      <w:rFonts w:ascii="Arial" w:hAnsi="Arial"/>
+      <w:color w:val="17212B"/>
+      <w:sz w:val="18"/>
     </w:rPr>
   </w:style>
   <w:style w:type="paragraph" w:styleId="Header">
@@ -1124,15 +1340,15 @@
     <w:pPr>
       <w:keepNext/>
       <w:keepLines/>
-      <w:spacing w:before="480" w:after="0"/>
+      <w:spacing w:before="0" w:after="0"/>
       <w:outlineLvl w:val="0"/>
     </w:pPr>
     <w:rPr>
-      <w:rFonts w:asciiTheme="majorHAnsi" w:eastAsiaTheme="majorEastAsia" w:hAnsiTheme="majorHAnsi" w:cstheme="majorBidi"/>
+      <w:rFonts w:asciiTheme="majorHAnsi" w:eastAsiaTheme="majorEastAsia" w:hAnsiTheme="majorHAnsi" w:cstheme="majorBidi" w:ascii="Arial" w:hAnsi="Arial"/>
       <w:b/>
       <w:bCs/>
-      <w:color w:val="365F91" w:themeColor="accent1" w:themeShade="BF"/>
-      <w:sz w:val="28"/>
+      <w:color w:val="111111"/>
+      <w:sz w:val="23"/>
       <w:szCs w:val="28"/>
     </w:rPr>
   </w:style>
@@ -1148,15 +1364,15 @@
     <w:pPr>
       <w:keepNext/>
       <w:keepLines/>
-      <w:spacing w:before="200" w:after="0"/>
+      <w:spacing w:before="0" w:after="0"/>
       <w:outlineLvl w:val="1"/>
     </w:pPr>
     <w:rPr>
-      <w:rFonts w:asciiTheme="majorHAnsi" w:eastAsiaTheme="majorEastAsia" w:hAnsiTheme="majorHAnsi" w:cstheme="majorBidi"/>
+      <w:rFonts w:asciiTheme="majorHAnsi" w:eastAsiaTheme="majorEastAsia" w:hAnsiTheme="majorHAnsi" w:cstheme="majorBidi" w:ascii="Arial" w:hAnsi="Arial"/>
       <w:b/>
       <w:bCs/>
-      <w:color w:val="4F81BD" w:themeColor="accent1"/>
-      <w:sz w:val="26"/>
+      <w:color w:val="111111"/>
+      <w:sz w:val="20"/>
       <w:szCs w:val="26"/>
     </w:rPr>
   </w:style>
@@ -1413,15 +1629,16 @@
       <w:pBdr>
         <w:bottom w:val="single" w:sz="8" w:space="4" w:color="4F81BD" w:themeColor="accent1"/>
       </w:pBdr>
-      <w:spacing w:after="300" w:line="240" w:lineRule="auto"/>
+      <w:spacing w:after="0" w:line="240" w:lineRule="auto" w:before="0"/>
       <w:contextualSpacing/>
     </w:pPr>
     <w:rPr>
-      <w:rFonts w:asciiTheme="majorHAnsi" w:eastAsiaTheme="majorEastAsia" w:hAnsiTheme="majorHAnsi" w:cstheme="majorBidi"/>
-      <w:color w:val="17365D" w:themeColor="text2" w:themeShade="BF"/>
+      <w:rFonts w:asciiTheme="majorHAnsi" w:eastAsiaTheme="majorEastAsia" w:hAnsiTheme="majorHAnsi" w:cstheme="majorBidi" w:ascii="Arial" w:hAnsi="Arial"/>
+      <w:b/>
+      <w:color w:val="FFFFFF"/>
       <w:spacing w:val="5"/>
       <w:kern w:val="28"/>
-      <w:sz w:val="52"/>
+      <w:sz w:val="46"/>
       <w:szCs w:val="52"/>
     </w:rPr>
   </w:style>
@@ -1452,12 +1669,14 @@
       <w:numPr>
         <w:ilvl w:val="1"/>
       </w:numPr>
+      <w:spacing w:before="0" w:after="0"/>
     </w:pPr>
     <w:rPr>
-      <w:rFonts w:asciiTheme="majorHAnsi" w:eastAsiaTheme="majorEastAsia" w:hAnsiTheme="majorHAnsi" w:cstheme="majorBidi"/>
+      <w:rFonts w:asciiTheme="majorHAnsi" w:eastAsiaTheme="majorEastAsia" w:hAnsiTheme="majorHAnsi" w:cstheme="majorBidi" w:ascii="Arial" w:hAnsi="Arial"/>
+      <w:b/>
       <w:i/>
       <w:iCs/>
-      <w:color w:val="4F81BD" w:themeColor="accent1"/>
+      <w:color w:val="FFFFFF"/>
       <w:spacing w:val="15"/>
       <w:sz w:val="24"/>
       <w:szCs w:val="24"/>

</xml_diff>